<commit_message>
feature: complete ssau v1 document semantics
- add semantic long-table headers and continuation labels
- report appendix counts in DOCX and PDF abstracts
- validate structured bibliography kinds and empty table cells
- exercise actual multi-page tables in the representative fixture
- extend regression coverage for the completed v1 dialect
</commit_message>
<xml_diff>
--- a/src/tex2sto/profiles/ssau/pandoc/reference.docx
+++ b/src/tex2sto/profiles/ssau/pandoc/reference.docx
@@ -12302,6 +12302,22 @@
       <w:b w:val="0"/>
       <w:i w:val="0"/>
       <w:sz w:val="28"/>
+    </w:rPr>
+  </w:style>
+  <w:style w:type="paragraph" w:customStyle="1" w:styleId="Tex2StoTableContinuation">
+    <w:name w:val="Tex2Sto Table Continuation"/>
+    <w:basedOn w:val="Normal"/>
+    <w:pPr>
+      <w:spacing w:line="360" w:lineRule="auto" w:before="0" w:after="0"/>
+      <w:ind w:firstLine="0"/>
+      <w:jc w:val="right"/>
+    </w:pPr>
+    <w:rPr>
+      <w:rFonts w:ascii="Times New Roman" w:hAnsi="Times New Roman" w:eastAsia="Times New Roman"/>
+      <w:b w:val="0"/>
+      <w:i w:val="0"/>
+      <w:color w:val="FFFFFF"/>
+      <w:sz w:val="24"/>
     </w:rPr>
   </w:style>
   <w:style w:type="paragraph" w:customStyle="1" w:styleId="Tex2StoEquation">

</xml_diff>

<commit_message>
feature: improve docx conformance and bibliography support
- correct headings, contents, lists, equations, appendices, and positioned content in DOCX
- add structured symbol explanations and expanded bibliography records
- document user-facing behavior and externally meaningful commit-subject guidance
</commit_message>
<xml_diff>
--- a/src/tex2sto/profiles/ssau/pandoc/reference.docx
+++ b/src/tex2sto/profiles/ssau/pandoc/reference.docx
@@ -477,7 +477,7 @@
     </w:pPr>
     <w:rPr>
       <w:rFonts w:asciiTheme="majorHAnsi" w:eastAsiaTheme="majorEastAsia" w:hAnsiTheme="majorHAnsi" w:cstheme="majorBidi" w:ascii="Times New Roman" w:hAnsi="Times New Roman" w:eastAsia="Times New Roman"/>
-      <w:b/>
+      <w:b w:val="0"/>
       <w:bCs/>
       <w:i w:val="0"/>
       <w:color w:val="365F91" w:themeColor="accent1" w:themeShade="BF"/>
@@ -502,7 +502,7 @@
     </w:pPr>
     <w:rPr>
       <w:rFonts w:asciiTheme="majorHAnsi" w:eastAsiaTheme="majorEastAsia" w:hAnsiTheme="majorHAnsi" w:cstheme="majorBidi" w:ascii="Times New Roman" w:hAnsi="Times New Roman" w:eastAsia="Times New Roman"/>
-      <w:b/>
+      <w:b w:val="0"/>
       <w:bCs/>
       <w:i w:val="0"/>
       <w:color w:val="4F81BD" w:themeColor="accent1"/>
@@ -529,7 +529,7 @@
       <w:rFonts w:asciiTheme="majorHAnsi" w:eastAsiaTheme="majorEastAsia" w:hAnsiTheme="majorHAnsi" w:cstheme="majorBidi" w:ascii="Times New Roman" w:hAnsi="Times New Roman" w:eastAsia="Times New Roman"/>
       <w:b w:val="0"/>
       <w:bCs/>
-      <w:i/>
+      <w:i w:val="0"/>
       <w:color w:val="4F81BD" w:themeColor="accent1"/>
       <w:sz w:val="28"/>
     </w:rPr>
@@ -554,7 +554,7 @@
       <w:rFonts w:asciiTheme="majorHAnsi" w:eastAsiaTheme="majorEastAsia" w:hAnsiTheme="majorHAnsi" w:cstheme="majorBidi" w:ascii="Times New Roman" w:hAnsi="Times New Roman" w:eastAsia="Times New Roman"/>
       <w:b w:val="0"/>
       <w:bCs/>
-      <w:i/>
+      <w:i w:val="0"/>
       <w:iCs/>
       <w:color w:val="4F81BD" w:themeColor="accent1"/>
       <w:sz w:val="28"/>
@@ -12129,7 +12129,7 @@
     </w:pPr>
     <w:rPr>
       <w:rFonts w:ascii="Times New Roman" w:hAnsi="Times New Roman" w:eastAsia="Times New Roman"/>
-      <w:b/>
+      <w:b w:val="0"/>
       <w:i w:val="0"/>
       <w:sz w:val="28"/>
     </w:rPr>
@@ -12142,69 +12142,6 @@
       <w:spacing w:line="360" w:lineRule="auto" w:before="240" w:after="120"/>
       <w:ind w:firstLine="0"/>
       <w:outlineLvl w:val="0"/>
-    </w:pPr>
-    <w:rPr>
-      <w:rFonts w:ascii="Times New Roman" w:hAnsi="Times New Roman" w:eastAsia="Times New Roman"/>
-      <w:b/>
-      <w:i w:val="0"/>
-      <w:sz w:val="28"/>
-    </w:rPr>
-  </w:style>
-  <w:style w:type="paragraph" w:customStyle="1" w:styleId="Tex2StoHeading2">
-    <w:name w:val="Tex2Sto Heading 2"/>
-    <w:basedOn w:val="Normal"/>
-    <w:pPr>
-      <w:keepNext/>
-      <w:spacing w:line="360" w:lineRule="auto" w:before="240" w:after="120"/>
-      <w:ind w:firstLine="0"/>
-      <w:outlineLvl w:val="1"/>
-    </w:pPr>
-    <w:rPr>
-      <w:rFonts w:ascii="Times New Roman" w:hAnsi="Times New Roman" w:eastAsia="Times New Roman"/>
-      <w:b/>
-      <w:i w:val="0"/>
-      <w:sz w:val="28"/>
-    </w:rPr>
-  </w:style>
-  <w:style w:type="paragraph" w:customStyle="1" w:styleId="Tex2StoHeading3">
-    <w:name w:val="Tex2Sto Heading 3"/>
-    <w:basedOn w:val="Normal"/>
-    <w:pPr>
-      <w:keepNext/>
-      <w:spacing w:line="360" w:lineRule="auto" w:before="240" w:after="120"/>
-      <w:ind w:firstLine="0"/>
-      <w:outlineLvl w:val="2"/>
-    </w:pPr>
-    <w:rPr>
-      <w:rFonts w:ascii="Times New Roman" w:hAnsi="Times New Roman" w:eastAsia="Times New Roman"/>
-      <w:b w:val="0"/>
-      <w:i/>
-      <w:sz w:val="28"/>
-    </w:rPr>
-  </w:style>
-  <w:style w:type="paragraph" w:customStyle="1" w:styleId="Tex2StoHeading4">
-    <w:name w:val="Tex2Sto Heading 4"/>
-    <w:basedOn w:val="Normal"/>
-    <w:pPr>
-      <w:keepNext/>
-      <w:spacing w:line="360" w:lineRule="auto" w:before="240" w:after="120"/>
-      <w:ind w:firstLine="0"/>
-      <w:outlineLvl w:val="3"/>
-    </w:pPr>
-    <w:rPr>
-      <w:rFonts w:ascii="Times New Roman" w:hAnsi="Times New Roman" w:eastAsia="Times New Roman"/>
-      <w:b w:val="0"/>
-      <w:i/>
-      <w:sz w:val="28"/>
-    </w:rPr>
-  </w:style>
-  <w:style w:type="paragraph" w:customStyle="1" w:styleId="Tex2StoFigureCaption">
-    <w:name w:val="Tex2Sto Figure Caption"/>
-    <w:basedOn w:val="Normal"/>
-    <w:pPr>
-      <w:spacing w:line="360" w:lineRule="auto" w:before="0" w:after="0"/>
-      <w:ind w:firstLine="0"/>
-      <w:jc w:val="center"/>
     </w:pPr>
     <w:rPr>
       <w:rFonts w:ascii="Times New Roman" w:hAnsi="Times New Roman" w:eastAsia="Times New Roman"/>
@@ -12213,14 +12150,14 @@
       <w:sz w:val="28"/>
     </w:rPr>
   </w:style>
-  <w:style w:type="paragraph" w:customStyle="1" w:styleId="Tex2StoTableCaption">
-    <w:name w:val="Tex2Sto Table Caption"/>
+  <w:style w:type="paragraph" w:customStyle="1" w:styleId="Tex2StoHeading2">
+    <w:name w:val="Tex2Sto Heading 2"/>
     <w:basedOn w:val="Normal"/>
     <w:pPr>
       <w:keepNext/>
-      <w:spacing w:line="360" w:lineRule="auto" w:before="0" w:after="0"/>
+      <w:spacing w:line="360" w:lineRule="auto" w:before="240" w:after="120"/>
       <w:ind w:firstLine="0"/>
-      <w:jc w:val="left"/>
+      <w:outlineLvl w:val="1"/>
     </w:pPr>
     <w:rPr>
       <w:rFonts w:ascii="Times New Roman" w:hAnsi="Times New Roman" w:eastAsia="Times New Roman"/>
@@ -12229,6 +12166,84 @@
       <w:sz w:val="28"/>
     </w:rPr>
   </w:style>
+  <w:style w:type="paragraph" w:customStyle="1" w:styleId="Tex2StoHeading3">
+    <w:name w:val="Tex2Sto Heading 3"/>
+    <w:basedOn w:val="Normal"/>
+    <w:pPr>
+      <w:keepNext/>
+      <w:spacing w:line="360" w:lineRule="auto" w:before="240" w:after="120"/>
+      <w:ind w:firstLine="0"/>
+      <w:outlineLvl w:val="2"/>
+    </w:pPr>
+    <w:rPr>
+      <w:rFonts w:ascii="Times New Roman" w:hAnsi="Times New Roman" w:eastAsia="Times New Roman"/>
+      <w:b w:val="0"/>
+      <w:i w:val="0"/>
+      <w:sz w:val="28"/>
+    </w:rPr>
+  </w:style>
+  <w:style w:type="paragraph" w:customStyle="1" w:styleId="Tex2StoHeading4">
+    <w:name w:val="Tex2Sto Heading 4"/>
+    <w:basedOn w:val="Normal"/>
+    <w:pPr>
+      <w:keepNext/>
+      <w:spacing w:line="360" w:lineRule="auto" w:before="240" w:after="120"/>
+      <w:ind w:firstLine="0"/>
+      <w:outlineLvl w:val="3"/>
+    </w:pPr>
+    <w:rPr>
+      <w:rFonts w:ascii="Times New Roman" w:hAnsi="Times New Roman" w:eastAsia="Times New Roman"/>
+      <w:b w:val="0"/>
+      <w:i w:val="0"/>
+      <w:sz w:val="28"/>
+    </w:rPr>
+  </w:style>
+  <w:style w:type="paragraph" w:customStyle="1" w:styleId="Tex2StoFigureContent">
+    <w:name w:val="Tex2Sto Figure Content"/>
+    <w:basedOn w:val="Normal"/>
+    <w:pPr>
+      <w:spacing w:line="360" w:lineRule="auto" w:before="0" w:after="0"/>
+      <w:ind w:firstLine="0"/>
+      <w:jc w:val="center"/>
+    </w:pPr>
+    <w:rPr>
+      <w:rFonts w:ascii="Times New Roman" w:hAnsi="Times New Roman" w:eastAsia="Times New Roman"/>
+      <w:b w:val="0"/>
+      <w:i w:val="0"/>
+      <w:sz w:val="28"/>
+    </w:rPr>
+  </w:style>
+  <w:style w:type="paragraph" w:customStyle="1" w:styleId="Tex2StoFigureCaption">
+    <w:name w:val="Tex2Sto Figure Caption"/>
+    <w:basedOn w:val="Normal"/>
+    <w:pPr>
+      <w:spacing w:line="360" w:lineRule="auto" w:before="0" w:after="0"/>
+      <w:ind w:firstLine="0"/>
+      <w:jc w:val="center"/>
+    </w:pPr>
+    <w:rPr>
+      <w:rFonts w:ascii="Times New Roman" w:hAnsi="Times New Roman" w:eastAsia="Times New Roman"/>
+      <w:b w:val="0"/>
+      <w:i w:val="0"/>
+      <w:sz w:val="28"/>
+    </w:rPr>
+  </w:style>
+  <w:style w:type="paragraph" w:customStyle="1" w:styleId="Tex2StoTableCaption">
+    <w:name w:val="Tex2Sto Table Caption"/>
+    <w:basedOn w:val="Normal"/>
+    <w:pPr>
+      <w:keepNext/>
+      <w:spacing w:line="360" w:lineRule="auto" w:before="0" w:after="0"/>
+      <w:ind w:firstLine="0"/>
+      <w:jc w:val="left"/>
+    </w:pPr>
+    <w:rPr>
+      <w:rFonts w:ascii="Times New Roman" w:hAnsi="Times New Roman" w:eastAsia="Times New Roman"/>
+      <w:b w:val="0"/>
+      <w:i w:val="0"/>
+      <w:sz w:val="28"/>
+    </w:rPr>
+  </w:style>
   <w:style w:type="paragraph" w:customStyle="1" w:styleId="Tex2StoTableText">
     <w:name w:val="Tex2Sto Table Text"/>
     <w:basedOn w:val="Normal"/>
@@ -12259,13 +12274,13 @@
       <w:sz w:val="24"/>
     </w:rPr>
   </w:style>
-  <w:style w:type="paragraph" w:customStyle="1" w:styleId="Tex2StoAbstractKeywords">
-    <w:name w:val="Tex2Sto Abstract Keywords"/>
+  <w:style w:type="paragraph" w:customStyle="1" w:styleId="Tex2StoSymbols">
+    <w:name w:val="Tex2Sto Symbols"/>
     <w:basedOn w:val="Normal"/>
     <w:pPr>
       <w:spacing w:line="360" w:lineRule="auto" w:before="0" w:after="0"/>
       <w:ind w:firstLine="0"/>
-      <w:jc w:val="both"/>
+      <w:jc w:val="left"/>
     </w:pPr>
     <w:rPr>
       <w:rFonts w:ascii="Times New Roman" w:hAnsi="Times New Roman" w:eastAsia="Times New Roman"/>
@@ -12274,6 +12289,21 @@
       <w:sz w:val="28"/>
     </w:rPr>
   </w:style>
+  <w:style w:type="paragraph" w:customStyle="1" w:styleId="Tex2StoAbstractKeywords">
+    <w:name w:val="Tex2Sto Abstract Keywords"/>
+    <w:basedOn w:val="Normal"/>
+    <w:pPr>
+      <w:spacing w:line="360" w:lineRule="auto" w:before="0" w:after="0"/>
+      <w:ind w:firstLine="0"/>
+      <w:jc w:val="both"/>
+    </w:pPr>
+    <w:rPr>
+      <w:rFonts w:ascii="Times New Roman" w:hAnsi="Times New Roman" w:eastAsia="Times New Roman"/>
+      <w:b w:val="0"/>
+      <w:i w:val="0"/>
+      <w:sz w:val="28"/>
+    </w:rPr>
+  </w:style>
   <w:style w:type="paragraph" w:customStyle="1" w:styleId="Tex2StoTitleInstitution">
     <w:name w:val="Tex2Sto Title Institution"/>
     <w:basedOn w:val="Normal"/>
@@ -12310,7 +12340,7 @@
     <w:pPr>
       <w:spacing w:line="360" w:lineRule="auto" w:before="0" w:after="0"/>
       <w:ind w:firstLine="0"/>
-      <w:jc w:val="right"/>
+      <w:jc w:val="left"/>
     </w:pPr>
     <w:rPr>
       <w:rFonts w:ascii="Times New Roman" w:hAnsi="Times New Roman" w:eastAsia="Times New Roman"/>
@@ -12325,8 +12355,8 @@
     <w:basedOn w:val="Normal"/>
     <w:pPr>
       <w:tabs>
-        <w:tab w:pos="4394" w:val="center"/>
-        <w:tab w:pos="8787" w:val="right"/>
+        <w:tab w:pos="4677" w:val="center"/>
+        <w:tab w:pos="9354" w:val="right"/>
       </w:tabs>
       <w:spacing w:line="360" w:lineRule="auto" w:before="0" w:after="0"/>
       <w:ind w:firstLine="0"/>
@@ -12344,7 +12374,7 @@
     <w:basedOn w:val="Normal"/>
     <w:pPr>
       <w:tabs>
-        <w:tab w:pos="8787" w:val="right" w:leader="dot"/>
+        <w:tab w:pos="9354" w:val="right" w:leader="dot"/>
       </w:tabs>
       <w:spacing w:line="360" w:lineRule="auto" w:before="0" w:after="0"/>
       <w:ind w:firstLine="0" w:left="0"/>
@@ -12362,7 +12392,7 @@
     <w:basedOn w:val="Normal"/>
     <w:pPr>
       <w:tabs>
-        <w:tab w:pos="8787" w:val="right" w:leader="dot"/>
+        <w:tab w:pos="9354" w:val="right" w:leader="dot"/>
       </w:tabs>
       <w:spacing w:line="360" w:lineRule="auto" w:before="0" w:after="0"/>
       <w:ind w:firstLine="0" w:left="283"/>
@@ -12380,7 +12410,7 @@
     <w:basedOn w:val="Normal"/>
     <w:pPr>
       <w:tabs>
-        <w:tab w:pos="8787" w:val="right" w:leader="dot"/>
+        <w:tab w:pos="9354" w:val="right" w:leader="dot"/>
       </w:tabs>
       <w:spacing w:line="360" w:lineRule="auto" w:before="0" w:after="0"/>
       <w:ind w:firstLine="0" w:left="567"/>
@@ -12398,7 +12428,7 @@
     <w:basedOn w:val="Normal"/>
     <w:pPr>
       <w:tabs>
-        <w:tab w:pos="8787" w:val="right" w:leader="dot"/>
+        <w:tab w:pos="9354" w:val="right" w:leader="dot"/>
       </w:tabs>
       <w:spacing w:line="360" w:lineRule="auto" w:before="0" w:after="0"/>
       <w:ind w:firstLine="0" w:left="850"/>

</xml_diff>

<commit_message>
fix: focus v1 release on docx output
- replace accidental Word soft breaks with real front-matter paragraphs and structural tests
- mark PDF as experimental until v2 and build the Docker image in CI
- update release documentation and validate the representative DOCX
</commit_message>
<xml_diff>
--- a/src/tex2sto/profiles/ssau/pandoc/reference.docx
+++ b/src/tex2sto/profiles/ssau/pandoc/reference.docx
@@ -12296,6 +12296,21 @@
       <w:spacing w:line="360" w:lineRule="auto" w:before="0" w:after="0"/>
       <w:ind w:firstLine="0"/>
       <w:jc w:val="both"/>
+    </w:pPr>
+    <w:rPr>
+      <w:rFonts w:ascii="Times New Roman" w:hAnsi="Times New Roman" w:eastAsia="Times New Roman"/>
+      <w:b w:val="0"/>
+      <w:i w:val="0"/>
+      <w:sz w:val="28"/>
+    </w:rPr>
+  </w:style>
+  <w:style w:type="paragraph" w:customStyle="1" w:styleId="Tex2StoAssignment">
+    <w:name w:val="Tex2Sto Assignment"/>
+    <w:basedOn w:val="Normal"/>
+    <w:pPr>
+      <w:spacing w:line="360" w:lineRule="auto" w:before="0" w:after="0"/>
+      <w:ind w:firstLine="0"/>
+      <w:jc w:val="left"/>
     </w:pPr>
     <w:rPr>
       <w:rFonts w:ascii="Times New Roman" w:hAnsi="Times New Roman" w:eastAsia="Times New Roman"/>

</xml_diff>